<commit_message>
Expand CompTIA PBQ-lite scenarios
</commit_message>
<xml_diff>
--- a/docs/freecertprep-board-report-2026-06-08.docx
+++ b/docs/freecertprep-board-report-2026-06-08.docx
@@ -254,7 +254,7 @@
           <w:color w:val="19212D"/>
           <w:sz w:val="22"/>
         </w:rPr>
-        <w:t>11,629 published IT practice questions.</w:t>
+        <w:t>11,678 published IT practice questions.</w:t>
       </w:r>
     </w:p>
     <w:p>
@@ -293,7 +293,7 @@
           <w:color w:val="19212D"/>
           <w:sz w:val="22"/>
         </w:rPr>
-        <w:t>14,780 authored questions across both product surfaces.</w:t>
+        <w:t>14,829 authored questions across both product surfaces.</w:t>
       </w:r>
     </w:p>
     <w:p>
@@ -2582,7 +2582,7 @@
                 <w:color w:val="19212D"/>
                 <w:sz w:val="19"/>
               </w:rPr>
-              <w:t>750</w:t>
+              <w:t>760</w:t>
             </w:r>
           </w:p>
         </w:tc>
@@ -2691,7 +2691,7 @@
                 <w:color w:val="19212D"/>
                 <w:sz w:val="19"/>
               </w:rPr>
-              <w:t>750</w:t>
+              <w:t>760</w:t>
             </w:r>
           </w:p>
         </w:tc>
@@ -2798,7 +2798,7 @@
                 <w:color w:val="19212D"/>
                 <w:sz w:val="19"/>
               </w:rPr>
-              <w:t>751</w:t>
+              <w:t>760</w:t>
             </w:r>
           </w:p>
         </w:tc>
@@ -2907,7 +2907,7 @@
                 <w:color w:val="19212D"/>
                 <w:sz w:val="19"/>
               </w:rPr>
-              <w:t>750</w:t>
+              <w:t>760</w:t>
             </w:r>
           </w:p>
         </w:tc>
@@ -3014,7 +3014,7 @@
                 <w:color w:val="19212D"/>
                 <w:sz w:val="19"/>
               </w:rPr>
-              <w:t>750</w:t>
+              <w:t>760</w:t>
             </w:r>
           </w:p>
         </w:tc>
@@ -5697,7 +5697,7 @@
           <w:color w:val="19212D"/>
           <w:sz w:val="22"/>
         </w:rPr>
-        <w:t xml:space="preserve"> still advertises approximately 5,800 questions, while the IT catalog alone has 11,629.</w:t>
+        <w:t xml:space="preserve"> still advertises approximately 5,800 questions, while the IT catalog alone has 11,678.</w:t>
       </w:r>
     </w:p>
     <w:p>

</xml_diff>